<commit_message>
Update Gruppe01_D1_Architektur-Blueprint_v1.1.1 fix & add
add wireframe
fix user flow
fix version ids
</commit_message>
<xml_diff>
--- a/Gruppe01_D1_Architektur-Blueprint_v1.1.1.docx
+++ b/Gruppe01_D1_Architektur-Blueprint_v1.1.1.docx
@@ -43,23 +43,57 @@
         <w:t>Architektur-Blueprint</w:t>
       </w:r>
     </w:p>
+    <w:p>
+      <w:r>
+        <w:t>Zwischenstand nach LS5</w:t>
+      </w:r>
+      <w:r>
+        <w:t xml:space="preserve"> - Version 1.0, </w:t>
+      </w:r>
+      <w:r>
+        <w:t>20</w:t>
+      </w:r>
+      <w:r>
+        <w:t>.09.2026</w:t>
+      </w:r>
+    </w:p>
+    <w:p>
+      <w:pPr>
+        <w:rPr>
+          <w:b/>
+          <w:sz w:val="32"/>
+          <w:szCs w:val="32"/>
+        </w:rPr>
+      </w:pPr>
+      <w:r>
+        <w:rPr>
+          <w:b/>
+          <w:sz w:val="32"/>
+          <w:szCs w:val="32"/>
+        </w:rPr>
+        <w:t>Versionierung</w:t>
+      </w:r>
+    </w:p>
     <w:tbl>
       <w:tblPr>
         <w:tblStyle w:val="Tabellenraster"/>
-        <w:tblpPr w:leftFromText="141" w:rightFromText="141" w:vertAnchor="page" w:horzAnchor="margin" w:tblpY="2425"/>
-        <w:tblW w:w="0" w:type="auto"/>
+        <w:tblpPr w:leftFromText="141" w:rightFromText="141" w:vertAnchor="page" w:horzAnchor="margin" w:tblpY="2895"/>
+        <w:tblW w:w="9709" w:type="dxa"/>
         <w:tblLook w:val="04A0" w:firstRow="1" w:lastRow="0" w:firstColumn="1" w:lastColumn="0" w:noHBand="0" w:noVBand="1"/>
       </w:tblPr>
       <w:tblGrid>
-        <w:gridCol w:w="2407"/>
-        <w:gridCol w:w="2407"/>
-        <w:gridCol w:w="2407"/>
-        <w:gridCol w:w="2407"/>
+        <w:gridCol w:w="2376"/>
+        <w:gridCol w:w="2389"/>
+        <w:gridCol w:w="2388"/>
+        <w:gridCol w:w="2556"/>
       </w:tblGrid>
       <w:tr>
+        <w:trPr>
+          <w:trHeight w:val="314"/>
+        </w:trPr>
         <w:tc>
           <w:tcPr>
-            <w:tcW w:w="2407" w:type="dxa"/>
+            <w:tcW w:w="2376" w:type="dxa"/>
             <w:shd w:val="clear" w:color="auto" w:fill="ADADAD" w:themeFill="background2" w:themeFillShade="BF"/>
           </w:tcPr>
           <w:p>
@@ -81,7 +115,7 @@
         </w:tc>
         <w:tc>
           <w:tcPr>
-            <w:tcW w:w="2407" w:type="dxa"/>
+            <w:tcW w:w="2389" w:type="dxa"/>
             <w:shd w:val="clear" w:color="auto" w:fill="ADADAD" w:themeFill="background2" w:themeFillShade="BF"/>
           </w:tcPr>
           <w:p>
@@ -103,7 +137,7 @@
         </w:tc>
         <w:tc>
           <w:tcPr>
-            <w:tcW w:w="2407" w:type="dxa"/>
+            <w:tcW w:w="2388" w:type="dxa"/>
             <w:shd w:val="clear" w:color="auto" w:fill="ADADAD" w:themeFill="background2" w:themeFillShade="BF"/>
           </w:tcPr>
           <w:p>
@@ -125,7 +159,7 @@
         </w:tc>
         <w:tc>
           <w:tcPr>
-            <w:tcW w:w="2407" w:type="dxa"/>
+            <w:tcW w:w="2556" w:type="dxa"/>
             <w:shd w:val="clear" w:color="auto" w:fill="ADADAD" w:themeFill="background2" w:themeFillShade="BF"/>
           </w:tcPr>
           <w:p>
@@ -147,9 +181,12 @@
         </w:tc>
       </w:tr>
       <w:tr>
+        <w:trPr>
+          <w:trHeight w:val="314"/>
+        </w:trPr>
         <w:tc>
           <w:tcPr>
-            <w:tcW w:w="2407" w:type="dxa"/>
+            <w:tcW w:w="2376" w:type="dxa"/>
             <w:shd w:val="clear" w:color="auto" w:fill="FFFFFF" w:themeFill="background1"/>
           </w:tcPr>
           <w:p>
@@ -165,13 +202,27 @@
                 <w:b/>
                 <w:bCs/>
               </w:rPr>
-              <w:t>V1.0.0</w:t>
+              <w:t>V</w:t>
+            </w:r>
+            <w:r>
+              <w:rPr>
+                <w:b/>
+                <w:bCs/>
+              </w:rPr>
+              <w:t>0</w:t>
+            </w:r>
+            <w:r>
+              <w:rPr>
+                <w:b/>
+                <w:bCs/>
+              </w:rPr>
+              <w:t>.0</w:t>
             </w:r>
           </w:p>
         </w:tc>
         <w:tc>
           <w:tcPr>
-            <w:tcW w:w="2407" w:type="dxa"/>
+            <w:tcW w:w="2389" w:type="dxa"/>
             <w:shd w:val="clear" w:color="auto" w:fill="FFFFFF" w:themeFill="background1"/>
           </w:tcPr>
           <w:p>
@@ -193,7 +244,7 @@
         </w:tc>
         <w:tc>
           <w:tcPr>
-            <w:tcW w:w="2407" w:type="dxa"/>
+            <w:tcW w:w="2388" w:type="dxa"/>
             <w:shd w:val="clear" w:color="auto" w:fill="FFFFFF" w:themeFill="background1"/>
           </w:tcPr>
           <w:p>
@@ -215,7 +266,7 @@
         </w:tc>
         <w:tc>
           <w:tcPr>
-            <w:tcW w:w="2407" w:type="dxa"/>
+            <w:tcW w:w="2556" w:type="dxa"/>
             <w:shd w:val="clear" w:color="auto" w:fill="FFFFFF" w:themeFill="background1"/>
           </w:tcPr>
           <w:p>
@@ -237,9 +288,12 @@
         </w:tc>
       </w:tr>
       <w:tr>
+        <w:trPr>
+          <w:trHeight w:val="314"/>
+        </w:trPr>
         <w:tc>
           <w:tcPr>
-            <w:tcW w:w="2407" w:type="dxa"/>
+            <w:tcW w:w="2376" w:type="dxa"/>
             <w:shd w:val="clear" w:color="auto" w:fill="FFFFFF" w:themeFill="background1"/>
           </w:tcPr>
           <w:p>
@@ -255,7 +309,21 @@
                 <w:b/>
                 <w:bCs/>
               </w:rPr>
-              <w:t>V1.0.</w:t>
+              <w:t>V</w:t>
+            </w:r>
+            <w:r>
+              <w:rPr>
+                <w:b/>
+                <w:bCs/>
+              </w:rPr>
+              <w:t>0</w:t>
+            </w:r>
+            <w:r>
+              <w:rPr>
+                <w:b/>
+                <w:bCs/>
+              </w:rPr>
+              <w:t>.</w:t>
             </w:r>
             <w:r>
               <w:rPr>
@@ -268,7 +336,7 @@
         </w:tc>
         <w:tc>
           <w:tcPr>
-            <w:tcW w:w="2407" w:type="dxa"/>
+            <w:tcW w:w="2389" w:type="dxa"/>
             <w:shd w:val="clear" w:color="auto" w:fill="FFFFFF" w:themeFill="background1"/>
           </w:tcPr>
           <w:p>
@@ -290,7 +358,7 @@
         </w:tc>
         <w:tc>
           <w:tcPr>
-            <w:tcW w:w="2407" w:type="dxa"/>
+            <w:tcW w:w="2388" w:type="dxa"/>
             <w:shd w:val="clear" w:color="auto" w:fill="FFFFFF" w:themeFill="background1"/>
           </w:tcPr>
           <w:p>
@@ -312,7 +380,7 @@
         </w:tc>
         <w:tc>
           <w:tcPr>
-            <w:tcW w:w="2407" w:type="dxa"/>
+            <w:tcW w:w="2556" w:type="dxa"/>
             <w:shd w:val="clear" w:color="auto" w:fill="FFFFFF" w:themeFill="background1"/>
           </w:tcPr>
           <w:p>
@@ -334,9 +402,12 @@
         </w:tc>
       </w:tr>
       <w:tr>
+        <w:trPr>
+          <w:trHeight w:val="314"/>
+        </w:trPr>
         <w:tc>
           <w:tcPr>
-            <w:tcW w:w="2407" w:type="dxa"/>
+            <w:tcW w:w="2376" w:type="dxa"/>
             <w:shd w:val="clear" w:color="auto" w:fill="FFFFFF" w:themeFill="background1"/>
           </w:tcPr>
           <w:p>
@@ -352,13 +423,34 @@
                 <w:b/>
                 <w:bCs/>
               </w:rPr>
-              <w:t>V.1.1.0</w:t>
+              <w:t>V</w:t>
+            </w:r>
+            <w:r>
+              <w:rPr>
+                <w:b/>
+                <w:bCs/>
+              </w:rPr>
+              <w:t>0</w:t>
+            </w:r>
+            <w:r>
+              <w:rPr>
+                <w:b/>
+                <w:bCs/>
+              </w:rPr>
+              <w:t>.</w:t>
+            </w:r>
+            <w:r>
+              <w:rPr>
+                <w:b/>
+                <w:bCs/>
+              </w:rPr>
+              <w:t>2</w:t>
             </w:r>
           </w:p>
         </w:tc>
         <w:tc>
           <w:tcPr>
-            <w:tcW w:w="2407" w:type="dxa"/>
+            <w:tcW w:w="2389" w:type="dxa"/>
             <w:shd w:val="clear" w:color="auto" w:fill="FFFFFF" w:themeFill="background1"/>
           </w:tcPr>
           <w:p>
@@ -380,7 +472,7 @@
         </w:tc>
         <w:tc>
           <w:tcPr>
-            <w:tcW w:w="2407" w:type="dxa"/>
+            <w:tcW w:w="2388" w:type="dxa"/>
             <w:shd w:val="clear" w:color="auto" w:fill="FFFFFF" w:themeFill="background1"/>
           </w:tcPr>
           <w:p>
@@ -409,7 +501,7 @@
         </w:tc>
         <w:tc>
           <w:tcPr>
-            <w:tcW w:w="2407" w:type="dxa"/>
+            <w:tcW w:w="2556" w:type="dxa"/>
             <w:shd w:val="clear" w:color="auto" w:fill="FFFFFF" w:themeFill="background1"/>
           </w:tcPr>
           <w:p>
@@ -431,9 +523,12 @@
         </w:tc>
       </w:tr>
       <w:tr>
+        <w:trPr>
+          <w:trHeight w:val="314"/>
+        </w:trPr>
         <w:tc>
           <w:tcPr>
-            <w:tcW w:w="2407" w:type="dxa"/>
+            <w:tcW w:w="2376" w:type="dxa"/>
             <w:shd w:val="clear" w:color="auto" w:fill="FFFFFF" w:themeFill="background1"/>
           </w:tcPr>
           <w:p>
@@ -449,13 +544,13 @@
                 <w:b/>
                 <w:bCs/>
               </w:rPr>
-              <w:t>V1.1.1</w:t>
+              <w:t>V0.3</w:t>
             </w:r>
           </w:p>
         </w:tc>
         <w:tc>
           <w:tcPr>
-            <w:tcW w:w="2407" w:type="dxa"/>
+            <w:tcW w:w="2389" w:type="dxa"/>
             <w:shd w:val="clear" w:color="auto" w:fill="FFFFFF" w:themeFill="background1"/>
           </w:tcPr>
           <w:p>
@@ -477,7 +572,7 @@
         </w:tc>
         <w:tc>
           <w:tcPr>
-            <w:tcW w:w="2407" w:type="dxa"/>
+            <w:tcW w:w="2388" w:type="dxa"/>
             <w:shd w:val="clear" w:color="auto" w:fill="FFFFFF" w:themeFill="background1"/>
           </w:tcPr>
           <w:p>
@@ -499,7 +594,7 @@
         </w:tc>
         <w:tc>
           <w:tcPr>
-            <w:tcW w:w="2407" w:type="dxa"/>
+            <w:tcW w:w="2556" w:type="dxa"/>
             <w:shd w:val="clear" w:color="auto" w:fill="FFFFFF" w:themeFill="background1"/>
           </w:tcPr>
           <w:p>
@@ -520,6 +615,99 @@
           </w:p>
         </w:tc>
       </w:tr>
+      <w:tr>
+        <w:trPr>
+          <w:trHeight w:val="314"/>
+        </w:trPr>
+        <w:tc>
+          <w:tcPr>
+            <w:tcW w:w="2376" w:type="dxa"/>
+            <w:shd w:val="clear" w:color="auto" w:fill="FFFFFF" w:themeFill="background1"/>
+          </w:tcPr>
+          <w:p>
+            <w:pPr>
+              <w:jc w:val="center"/>
+              <w:rPr>
+                <w:b/>
+                <w:bCs/>
+              </w:rPr>
+            </w:pPr>
+            <w:r>
+              <w:rPr>
+                <w:b/>
+                <w:bCs/>
+              </w:rPr>
+              <w:t>V1.0</w:t>
+            </w:r>
+          </w:p>
+        </w:tc>
+        <w:tc>
+          <w:tcPr>
+            <w:tcW w:w="2389" w:type="dxa"/>
+            <w:shd w:val="clear" w:color="auto" w:fill="FFFFFF" w:themeFill="background1"/>
+          </w:tcPr>
+          <w:p>
+            <w:pPr>
+              <w:jc w:val="center"/>
+              <w:rPr>
+                <w:b/>
+                <w:bCs/>
+              </w:rPr>
+            </w:pPr>
+            <w:r>
+              <w:rPr>
+                <w:b/>
+                <w:bCs/>
+              </w:rPr>
+              <w:t>20.09.2026</w:t>
+            </w:r>
+          </w:p>
+        </w:tc>
+        <w:tc>
+          <w:tcPr>
+            <w:tcW w:w="2388" w:type="dxa"/>
+            <w:shd w:val="clear" w:color="auto" w:fill="FFFFFF" w:themeFill="background1"/>
+          </w:tcPr>
+          <w:p>
+            <w:pPr>
+              <w:jc w:val="center"/>
+              <w:rPr>
+                <w:b/>
+                <w:bCs/>
+              </w:rPr>
+            </w:pPr>
+            <w:r>
+              <w:rPr>
+                <w:b/>
+                <w:bCs/>
+              </w:rPr>
+              <w:t>Sanjivan</w:t>
+            </w:r>
+          </w:p>
+        </w:tc>
+        <w:tc>
+          <w:tcPr>
+            <w:tcW w:w="2556" w:type="dxa"/>
+            <w:shd w:val="clear" w:color="auto" w:fill="FFFFFF" w:themeFill="background1"/>
+          </w:tcPr>
+          <w:p>
+            <w:pPr>
+              <w:jc w:val="center"/>
+              <w:rPr>
+                <w:b/>
+                <w:bCs/>
+              </w:rPr>
+            </w:pPr>
+            <w:r>
+              <w:rPr>
+                <w:b/>
+                <w:bCs/>
+              </w:rPr>
+              <w:t>Korrektur/Anpassung</w:t>
+            </w:r>
+          </w:p>
+        </w:tc>
+      </w:tr>
     </w:tbl>
     <w:p>
       <w:pPr>
@@ -529,55 +717,36 @@
           <w:szCs w:val="32"/>
         </w:rPr>
       </w:pPr>
-      <w:r>
+    </w:p>
+    <w:p>
+      <w:pPr>
         <w:rPr>
           <w:b/>
           <w:sz w:val="32"/>
           <w:szCs w:val="32"/>
         </w:rPr>
-        <w:t>Versionierung</w:t>
-      </w:r>
-    </w:p>
-    <w:p>
-      <w:pPr>
-        <w:rPr>
-          <w:b/>
-          <w:bCs/>
-          <w:sz w:val="28"/>
-          <w:szCs w:val="28"/>
-        </w:rPr>
-      </w:pPr>
-    </w:p>
-    <w:p>
-      <w:pPr>
+      </w:pPr>
+      <w:r>
         <w:rPr>
           <w:b/>
           <w:sz w:val="32"/>
           <w:szCs w:val="32"/>
         </w:rPr>
-      </w:pPr>
-      <w:r>
-        <w:rPr>
-          <w:b/>
-          <w:sz w:val="32"/>
-          <w:szCs w:val="32"/>
-        </w:rPr>
         <w:t>JourneyMap</w:t>
       </w:r>
     </w:p>
     <w:p>
       <w:pPr>
+        <w:pStyle w:val="KeinLeerraum"/>
         <w:rPr>
           <w:b/>
           <w:bCs/>
-          <w:sz w:val="32"/>
-          <w:szCs w:val="32"/>
-        </w:rPr>
-      </w:pPr>
-    </w:p>
-    <w:p>
-      <w:pPr>
-        <w:pStyle w:val="KeinLeerraum"/>
+          <w:sz w:val="28"/>
+          <w:szCs w:val="28"/>
+          <w:u w:val="single"/>
+        </w:rPr>
+      </w:pPr>
+      <w:r>
         <w:rPr>
           <w:b/>
           <w:bCs/>
@@ -585,61 +754,66 @@
           <w:szCs w:val="28"/>
           <w:u w:val="single"/>
         </w:rPr>
-      </w:pPr>
-      <w:r>
-        <w:rPr>
-          <w:b/>
+        <w:t>Zielhandlungen</w:t>
+      </w:r>
+    </w:p>
+    <w:p>
+      <w:pPr>
+        <w:pStyle w:val="KeinLeerraum"/>
+      </w:pPr>
+      <w:r>
+        <w:t>Eine Person möchte mit unserer Lösung ihre Reisefotos automatisch nach Reise und Ort ordnen lassen, damit sie ihre Erinnerungen schnell wiederfindet.</w:t>
+      </w:r>
+    </w:p>
+    <w:p>
+      <w:pPr>
+        <w:pStyle w:val="KeinLeerraum"/>
+        <w:rPr>
+          <w:b/>
+        </w:rPr>
+      </w:pPr>
+    </w:p>
+    <w:p>
+      <w:pPr>
+        <w:pStyle w:val="KeinLeerraum"/>
+        <w:rPr>
           <w:bCs/>
-          <w:sz w:val="28"/>
-          <w:szCs w:val="28"/>
-          <w:u w:val="single"/>
-        </w:rPr>
-        <w:t>Zielhandlungen</w:t>
-      </w:r>
-    </w:p>
-    <w:p>
-      <w:pPr>
-        <w:pStyle w:val="KeinLeerraum"/>
-      </w:pPr>
-      <w:r>
-        <w:t>Eine Person möchte mit unserer Lösung ihre Reisefotos automatisch nach Reise und Ort ordnen lassen, damit sie ihre Erinnerungen schnell wiederfindet.</w:t>
-      </w:r>
-    </w:p>
-    <w:p>
-      <w:pPr>
-        <w:pStyle w:val="KeinLeerraum"/>
-        <w:rPr>
-          <w:b/>
-        </w:rPr>
-      </w:pPr>
-    </w:p>
-    <w:p>
-      <w:pPr>
-        <w:pStyle w:val="KeinLeerraum"/>
+        </w:rPr>
+      </w:pPr>
+      <w:r>
+        <w:rPr>
+          <w:b/>
+        </w:rPr>
+        <w:t xml:space="preserve">Ausganspunkt: </w:t>
+      </w:r>
+      <w:r>
         <w:rPr>
           <w:bCs/>
         </w:rPr>
-      </w:pPr>
-      <w:r>
-        <w:rPr>
-          <w:b/>
-        </w:rPr>
-        <w:t xml:space="preserve">Ausganspunkt: </w:t>
-      </w:r>
-      <w:r>
+        <w:t>Eine Person hat viele unsortierte Fotos von einer Reise.</w:t>
+      </w:r>
+    </w:p>
+    <w:p>
+      <w:pPr>
+        <w:pStyle w:val="KeinLeerraum"/>
         <w:rPr>
           <w:bCs/>
         </w:rPr>
-        <w:t>Eine Person hat viele unsortierte Fotos von einer Reise.</w:t>
-      </w:r>
-    </w:p>
-    <w:p>
-      <w:pPr>
-        <w:pStyle w:val="KeinLeerraum"/>
-        <w:rPr>
-          <w:bCs/>
-        </w:rPr>
-      </w:pPr>
+      </w:pPr>
+    </w:p>
+    <w:p>
+      <w:pPr>
+        <w:pStyle w:val="KeinLeerraum"/>
+        <w:rPr>
+          <w:b/>
+        </w:rPr>
+      </w:pPr>
+      <w:r>
+        <w:rPr>
+          <w:b/>
+        </w:rPr>
+        <w:t>User Flow:</w:t>
+      </w:r>
     </w:p>
     <w:p>
       <w:pPr>
@@ -932,7 +1106,6 @@
           <w:szCs w:val="28"/>
           <w:u w:val="single"/>
         </w:rPr>
-        <w:lastRenderedPageBreak/>
         <w:t>Wireframe 1: Dashboard</w:t>
       </w:r>
     </w:p>
@@ -948,9 +1121,9 @@
           <w:noProof/>
         </w:rPr>
         <w:drawing>
-          <wp:inline distT="0" distB="0" distL="0" distR="0" wp14:anchorId="4E6820B7" wp14:editId="2CF85B26">
-            <wp:extent cx="5423564" cy="4069080"/>
-            <wp:effectExtent l="0" t="0" r="5715" b="7620"/>
+          <wp:inline distT="0" distB="0" distL="0" distR="0" wp14:anchorId="4E6820B7" wp14:editId="07A7761D">
+            <wp:extent cx="5244440" cy="3934691"/>
+            <wp:effectExtent l="0" t="0" r="0" b="8890"/>
             <wp:docPr id="128963575" name="Grafik 1"/>
             <wp:cNvGraphicFramePr>
               <a:graphicFrameLocks xmlns:a="http://schemas.openxmlformats.org/drawingml/2006/main" noChangeAspect="1"/>
@@ -980,7 +1153,7 @@
                   <pic:spPr bwMode="auto">
                     <a:xfrm>
                       <a:off x="0" y="0"/>
-                      <a:ext cx="5437856" cy="4079803"/>
+                      <a:ext cx="5274721" cy="3957409"/>
                     </a:xfrm>
                     <a:prstGeom prst="rect">
                       <a:avLst/>
@@ -1024,47 +1197,8 @@
           <w:szCs w:val="28"/>
           <w:u w:val="single"/>
         </w:rPr>
-        <w:t xml:space="preserve">Wireframe </w:t>
-      </w:r>
-      <w:r>
-        <w:rPr>
-          <w:b/>
-          <w:sz w:val="28"/>
-          <w:szCs w:val="28"/>
-          <w:u w:val="single"/>
-        </w:rPr>
-        <w:t>2</w:t>
-      </w:r>
-      <w:r>
-        <w:rPr>
-          <w:b/>
-          <w:sz w:val="28"/>
-          <w:szCs w:val="28"/>
-          <w:u w:val="single"/>
-        </w:rPr>
-        <w:t xml:space="preserve">: </w:t>
-      </w:r>
-      <w:r>
-        <w:rPr>
-          <w:b/>
-          <w:sz w:val="28"/>
-          <w:szCs w:val="28"/>
-          <w:u w:val="single"/>
-        </w:rPr>
-        <w:t>Suchbereich</w:t>
-      </w:r>
-    </w:p>
-    <w:p>
-      <w:pPr>
-        <w:pStyle w:val="KeinLeerraum"/>
-        <w:jc w:val="both"/>
-        <w:rPr>
-          <w:b/>
-          <w:sz w:val="28"/>
-          <w:szCs w:val="28"/>
-          <w:u w:val="single"/>
-        </w:rPr>
-      </w:pPr>
+        <w:t>Wireframe 2: Suchbereich</w:t>
+      </w:r>
     </w:p>
     <w:p>
       <w:pPr>
@@ -1084,7 +1218,7 @@
         <mc:AlternateContent>
           <mc:Choice Requires="wps">
             <w:drawing>
-              <wp:anchor distT="0" distB="0" distL="114300" distR="114300" simplePos="0" relativeHeight="251659264" behindDoc="0" locked="0" layoutInCell="1" allowOverlap="1" wp14:anchorId="1C4D2934" wp14:editId="566914E6">
+              <wp:anchor distT="0" distB="0" distL="114300" distR="114300" simplePos="0" relativeHeight="251659264" behindDoc="0" locked="0" layoutInCell="1" allowOverlap="1" wp14:anchorId="1C4D2934" wp14:editId="3C2444BA">
                 <wp:simplePos x="0" y="0"/>
                 <wp:positionH relativeFrom="column">
                   <wp:posOffset>86360</wp:posOffset>
@@ -1163,8 +1297,8 @@
           <w:noProof/>
         </w:rPr>
         <w:drawing>
-          <wp:inline distT="0" distB="0" distL="0" distR="0" wp14:anchorId="32AC7C33" wp14:editId="6653BE04">
-            <wp:extent cx="3535680" cy="4123888"/>
+          <wp:inline distT="0" distB="0" distL="0" distR="0" wp14:anchorId="32AC7C33" wp14:editId="34504D05">
+            <wp:extent cx="3535680" cy="4123690"/>
             <wp:effectExtent l="0" t="0" r="7620" b="0"/>
             <wp:docPr id="1449203038" name="Grafik 2"/>
             <wp:cNvGraphicFramePr>
@@ -1195,7 +1329,7 @@
                   <pic:spPr bwMode="auto">
                     <a:xfrm>
                       <a:off x="0" y="0"/>
-                      <a:ext cx="3543417" cy="4132912"/>
+                      <a:ext cx="3535680" cy="4123690"/>
                     </a:xfrm>
                     <a:prstGeom prst="rect">
                       <a:avLst/>
@@ -1226,14 +1360,426 @@
           <w:sz w:val="28"/>
           <w:szCs w:val="28"/>
           <w:u w:val="single"/>
-        </w:rPr>
-      </w:pPr>
-      <w:r>
-        <w:rPr>
-          <w:b/>
-          <w:sz w:val="28"/>
-          <w:szCs w:val="28"/>
-          <w:u w:val="single"/>
+          <w:lang w:val="en-US"/>
+        </w:rPr>
+      </w:pPr>
+      <w:r>
+        <w:rPr>
+          <w:b/>
+          <w:sz w:val="28"/>
+          <w:szCs w:val="28"/>
+          <w:u w:val="single"/>
+          <w:lang w:val="en-US"/>
+        </w:rPr>
+        <w:lastRenderedPageBreak/>
+        <w:t xml:space="preserve">Wireframe 3: </w:t>
+      </w:r>
+      <w:r>
+        <w:rPr>
+          <w:b/>
+          <w:sz w:val="28"/>
+          <w:szCs w:val="28"/>
+          <w:u w:val="single"/>
+          <w:lang w:val="en-US"/>
+        </w:rPr>
+        <w:t>Meine Reise</w:t>
+      </w:r>
+    </w:p>
+    <w:p>
+      <w:pPr>
+        <w:pStyle w:val="KeinLeerraum"/>
+        <w:jc w:val="both"/>
+        <w:rPr>
+          <w:b/>
+          <w:sz w:val="28"/>
+          <w:szCs w:val="28"/>
+          <w:u w:val="single"/>
+          <w:lang w:val="en-US"/>
+        </w:rPr>
+      </w:pPr>
+    </w:p>
+    <w:p>
+      <w:pPr>
+        <w:pStyle w:val="KeinLeerraum"/>
+        <w:jc w:val="both"/>
+        <w:rPr>
+          <w:b/>
+          <w:sz w:val="28"/>
+          <w:szCs w:val="28"/>
+          <w:u w:val="single"/>
+          <w:lang w:val="en-US"/>
+        </w:rPr>
+      </w:pPr>
+      <w:r>
+        <w:rPr>
+          <w:b/>
+          <w:noProof/>
+          <w:sz w:val="28"/>
+          <w:szCs w:val="28"/>
+          <w:u w:val="single"/>
+          <w:lang w:val="en-US"/>
+        </w:rPr>
+        <w:drawing>
+          <wp:inline distT="0" distB="0" distL="0" distR="0" wp14:anchorId="6DF755CA" wp14:editId="52C10B8C">
+            <wp:extent cx="6120130" cy="3444240"/>
+            <wp:effectExtent l="0" t="0" r="0" b="3810"/>
+            <wp:docPr id="1482017126" name="Grafik 3"/>
+            <wp:cNvGraphicFramePr>
+              <a:graphicFrameLocks xmlns:a="http://schemas.openxmlformats.org/drawingml/2006/main" noChangeAspect="1"/>
+            </wp:cNvGraphicFramePr>
+            <a:graphic xmlns:a="http://schemas.openxmlformats.org/drawingml/2006/main">
+              <a:graphicData uri="http://schemas.openxmlformats.org/drawingml/2006/picture">
+                <pic:pic xmlns:pic="http://schemas.openxmlformats.org/drawingml/2006/picture">
+                  <pic:nvPicPr>
+                    <pic:cNvPr id="1482017126" name="Grafik 1482017126"/>
+                    <pic:cNvPicPr/>
+                  </pic:nvPicPr>
+                  <pic:blipFill>
+                    <a:blip r:embed="rId13" cstate="print">
+                      <a:extLst>
+                        <a:ext uri="{28A0092B-C50C-407E-A947-70E740481C1C}">
+                          <a14:useLocalDpi xmlns:a14="http://schemas.microsoft.com/office/drawing/2010/main" val="0"/>
+                        </a:ext>
+                      </a:extLst>
+                    </a:blip>
+                    <a:stretch>
+                      <a:fillRect/>
+                    </a:stretch>
+                  </pic:blipFill>
+                  <pic:spPr>
+                    <a:xfrm>
+                      <a:off x="0" y="0"/>
+                      <a:ext cx="6120130" cy="3444240"/>
+                    </a:xfrm>
+                    <a:prstGeom prst="rect">
+                      <a:avLst/>
+                    </a:prstGeom>
+                  </pic:spPr>
+                </pic:pic>
+              </a:graphicData>
+            </a:graphic>
+          </wp:inline>
+        </w:drawing>
+      </w:r>
+    </w:p>
+    <w:p>
+      <w:pPr>
+        <w:pStyle w:val="KeinLeerraum"/>
+        <w:jc w:val="both"/>
+        <w:rPr>
+          <w:b/>
+          <w:sz w:val="28"/>
+          <w:szCs w:val="28"/>
+          <w:u w:val="single"/>
+          <w:lang w:val="en-US"/>
+        </w:rPr>
+      </w:pPr>
+    </w:p>
+    <w:p>
+      <w:pPr>
+        <w:pStyle w:val="KeinLeerraum"/>
+        <w:jc w:val="both"/>
+        <w:rPr>
+          <w:b/>
+          <w:sz w:val="28"/>
+          <w:szCs w:val="28"/>
+          <w:u w:val="single"/>
+          <w:lang w:val="en-US"/>
+        </w:rPr>
+      </w:pPr>
+    </w:p>
+    <w:p>
+      <w:pPr>
+        <w:pStyle w:val="KeinLeerraum"/>
+        <w:jc w:val="both"/>
+        <w:rPr>
+          <w:b/>
+          <w:sz w:val="28"/>
+          <w:szCs w:val="28"/>
+          <w:u w:val="single"/>
+          <w:lang w:val="en-US"/>
+        </w:rPr>
+      </w:pPr>
+    </w:p>
+    <w:p>
+      <w:pPr>
+        <w:pStyle w:val="KeinLeerraum"/>
+        <w:jc w:val="both"/>
+        <w:rPr>
+          <w:b/>
+          <w:sz w:val="28"/>
+          <w:szCs w:val="28"/>
+          <w:u w:val="single"/>
+          <w:lang w:val="en-US"/>
+        </w:rPr>
+      </w:pPr>
+    </w:p>
+    <w:p>
+      <w:pPr>
+        <w:pStyle w:val="KeinLeerraum"/>
+        <w:jc w:val="both"/>
+        <w:rPr>
+          <w:b/>
+          <w:sz w:val="28"/>
+          <w:szCs w:val="28"/>
+          <w:u w:val="single"/>
+          <w:lang w:val="en-US"/>
+        </w:rPr>
+      </w:pPr>
+    </w:p>
+    <w:p>
+      <w:pPr>
+        <w:pStyle w:val="KeinLeerraum"/>
+        <w:jc w:val="both"/>
+        <w:rPr>
+          <w:b/>
+          <w:sz w:val="28"/>
+          <w:szCs w:val="28"/>
+          <w:u w:val="single"/>
+          <w:lang w:val="en-US"/>
+        </w:rPr>
+      </w:pPr>
+    </w:p>
+    <w:p>
+      <w:pPr>
+        <w:pStyle w:val="KeinLeerraum"/>
+        <w:jc w:val="both"/>
+        <w:rPr>
+          <w:b/>
+          <w:sz w:val="28"/>
+          <w:szCs w:val="28"/>
+          <w:u w:val="single"/>
+          <w:lang w:val="en-US"/>
+        </w:rPr>
+      </w:pPr>
+    </w:p>
+    <w:p>
+      <w:pPr>
+        <w:pStyle w:val="KeinLeerraum"/>
+        <w:jc w:val="both"/>
+        <w:rPr>
+          <w:b/>
+          <w:sz w:val="28"/>
+          <w:szCs w:val="28"/>
+          <w:u w:val="single"/>
+          <w:lang w:val="en-US"/>
+        </w:rPr>
+      </w:pPr>
+    </w:p>
+    <w:p>
+      <w:pPr>
+        <w:pStyle w:val="KeinLeerraum"/>
+        <w:jc w:val="both"/>
+        <w:rPr>
+          <w:b/>
+          <w:sz w:val="28"/>
+          <w:szCs w:val="28"/>
+          <w:u w:val="single"/>
+          <w:lang w:val="en-US"/>
+        </w:rPr>
+      </w:pPr>
+    </w:p>
+    <w:p>
+      <w:pPr>
+        <w:pStyle w:val="KeinLeerraum"/>
+        <w:jc w:val="both"/>
+        <w:rPr>
+          <w:b/>
+          <w:sz w:val="28"/>
+          <w:szCs w:val="28"/>
+          <w:u w:val="single"/>
+          <w:lang w:val="en-US"/>
+        </w:rPr>
+      </w:pPr>
+    </w:p>
+    <w:p>
+      <w:pPr>
+        <w:pStyle w:val="KeinLeerraum"/>
+        <w:jc w:val="both"/>
+        <w:rPr>
+          <w:b/>
+          <w:sz w:val="28"/>
+          <w:szCs w:val="28"/>
+          <w:u w:val="single"/>
+          <w:lang w:val="en-US"/>
+        </w:rPr>
+      </w:pPr>
+    </w:p>
+    <w:p>
+      <w:pPr>
+        <w:pStyle w:val="KeinLeerraum"/>
+        <w:jc w:val="both"/>
+        <w:rPr>
+          <w:b/>
+          <w:sz w:val="28"/>
+          <w:szCs w:val="28"/>
+          <w:u w:val="single"/>
+          <w:lang w:val="en-US"/>
+        </w:rPr>
+      </w:pPr>
+    </w:p>
+    <w:p>
+      <w:pPr>
+        <w:pStyle w:val="KeinLeerraum"/>
+        <w:jc w:val="both"/>
+        <w:rPr>
+          <w:b/>
+          <w:sz w:val="28"/>
+          <w:szCs w:val="28"/>
+          <w:u w:val="single"/>
+          <w:lang w:val="en-US"/>
+        </w:rPr>
+      </w:pPr>
+    </w:p>
+    <w:p>
+      <w:pPr>
+        <w:pStyle w:val="KeinLeerraum"/>
+        <w:jc w:val="both"/>
+        <w:rPr>
+          <w:b/>
+          <w:sz w:val="28"/>
+          <w:szCs w:val="28"/>
+          <w:u w:val="single"/>
+          <w:lang w:val="en-US"/>
+        </w:rPr>
+      </w:pPr>
+    </w:p>
+    <w:p>
+      <w:pPr>
+        <w:pStyle w:val="KeinLeerraum"/>
+        <w:jc w:val="both"/>
+        <w:rPr>
+          <w:b/>
+          <w:sz w:val="28"/>
+          <w:szCs w:val="28"/>
+          <w:u w:val="single"/>
+          <w:lang w:val="en-US"/>
+        </w:rPr>
+      </w:pPr>
+    </w:p>
+    <w:p>
+      <w:pPr>
+        <w:pStyle w:val="KeinLeerraum"/>
+        <w:jc w:val="both"/>
+        <w:rPr>
+          <w:b/>
+          <w:sz w:val="28"/>
+          <w:szCs w:val="28"/>
+          <w:u w:val="single"/>
+          <w:lang w:val="en-US"/>
+        </w:rPr>
+      </w:pPr>
+    </w:p>
+    <w:p>
+      <w:pPr>
+        <w:pStyle w:val="KeinLeerraum"/>
+        <w:jc w:val="both"/>
+        <w:rPr>
+          <w:b/>
+          <w:sz w:val="28"/>
+          <w:szCs w:val="28"/>
+          <w:u w:val="single"/>
+          <w:lang w:val="en-US"/>
+        </w:rPr>
+      </w:pPr>
+    </w:p>
+    <w:p>
+      <w:pPr>
+        <w:pStyle w:val="KeinLeerraum"/>
+        <w:jc w:val="both"/>
+        <w:rPr>
+          <w:b/>
+          <w:sz w:val="28"/>
+          <w:szCs w:val="28"/>
+          <w:u w:val="single"/>
+          <w:lang w:val="en-US"/>
+        </w:rPr>
+      </w:pPr>
+    </w:p>
+    <w:p>
+      <w:pPr>
+        <w:pStyle w:val="KeinLeerraum"/>
+        <w:jc w:val="both"/>
+        <w:rPr>
+          <w:b/>
+          <w:sz w:val="28"/>
+          <w:szCs w:val="28"/>
+          <w:u w:val="single"/>
+          <w:lang w:val="en-US"/>
+        </w:rPr>
+      </w:pPr>
+    </w:p>
+    <w:p>
+      <w:pPr>
+        <w:pStyle w:val="KeinLeerraum"/>
+        <w:jc w:val="both"/>
+        <w:rPr>
+          <w:b/>
+          <w:sz w:val="28"/>
+          <w:szCs w:val="28"/>
+          <w:u w:val="single"/>
+          <w:lang w:val="en-US"/>
+        </w:rPr>
+      </w:pPr>
+    </w:p>
+    <w:p>
+      <w:pPr>
+        <w:pStyle w:val="KeinLeerraum"/>
+        <w:jc w:val="both"/>
+        <w:rPr>
+          <w:b/>
+          <w:sz w:val="28"/>
+          <w:szCs w:val="28"/>
+          <w:u w:val="single"/>
+          <w:lang w:val="en-US"/>
+        </w:rPr>
+      </w:pPr>
+    </w:p>
+    <w:p>
+      <w:pPr>
+        <w:pStyle w:val="KeinLeerraum"/>
+        <w:jc w:val="both"/>
+        <w:rPr>
+          <w:b/>
+          <w:sz w:val="28"/>
+          <w:szCs w:val="28"/>
+          <w:u w:val="single"/>
+          <w:lang w:val="en-US"/>
+        </w:rPr>
+      </w:pPr>
+    </w:p>
+    <w:p>
+      <w:pPr>
+        <w:pStyle w:val="KeinLeerraum"/>
+        <w:jc w:val="both"/>
+        <w:rPr>
+          <w:b/>
+          <w:sz w:val="28"/>
+          <w:szCs w:val="28"/>
+          <w:u w:val="single"/>
+          <w:lang w:val="en-US"/>
+        </w:rPr>
+      </w:pPr>
+    </w:p>
+    <w:p>
+      <w:pPr>
+        <w:pStyle w:val="KeinLeerraum"/>
+        <w:jc w:val="both"/>
+        <w:rPr>
+          <w:b/>
+          <w:sz w:val="28"/>
+          <w:szCs w:val="28"/>
+          <w:u w:val="single"/>
+          <w:lang w:val="en-US"/>
+        </w:rPr>
+      </w:pPr>
+      <w:r>
+        <w:rPr>
+          <w:b/>
+          <w:sz w:val="28"/>
+          <w:szCs w:val="28"/>
+          <w:u w:val="single"/>
+          <w:lang w:val="en-US"/>
         </w:rPr>
         <w:lastRenderedPageBreak/>
         <w:t xml:space="preserve">Wireframe </w:t>
@@ -1244,15 +1790,17 @@
           <w:sz w:val="28"/>
           <w:szCs w:val="28"/>
           <w:u w:val="single"/>
-        </w:rPr>
-        <w:t>3</w:t>
-      </w:r>
-      <w:r>
-        <w:rPr>
-          <w:b/>
-          <w:sz w:val="28"/>
-          <w:szCs w:val="28"/>
-          <w:u w:val="single"/>
+          <w:lang w:val="en-US"/>
+        </w:rPr>
+        <w:t>4</w:t>
+      </w:r>
+      <w:r>
+        <w:rPr>
+          <w:b/>
+          <w:sz w:val="28"/>
+          <w:szCs w:val="28"/>
+          <w:u w:val="single"/>
+          <w:lang w:val="en-US"/>
         </w:rPr>
         <w:t>.1</w:t>
       </w:r>
@@ -1262,6 +1810,7 @@
           <w:sz w:val="28"/>
           <w:szCs w:val="28"/>
           <w:u w:val="single"/>
+          <w:lang w:val="en-US"/>
         </w:rPr>
         <w:t xml:space="preserve">: </w:t>
       </w:r>
@@ -1271,6 +1820,7 @@
           <w:sz w:val="28"/>
           <w:szCs w:val="28"/>
           <w:u w:val="single"/>
+          <w:lang w:val="en-US"/>
         </w:rPr>
         <w:t>Top-</w:t>
       </w:r>
@@ -1280,6 +1830,7 @@
           <w:sz w:val="28"/>
           <w:szCs w:val="28"/>
           <w:u w:val="single"/>
+          <w:lang w:val="en-US"/>
         </w:rPr>
         <w:t>Landingpage</w:t>
       </w:r>
@@ -1287,21 +1838,10 @@
     <w:p>
       <w:pPr>
         <w:pStyle w:val="KeinLeerraum"/>
-        <w:jc w:val="both"/>
-        <w:rPr>
-          <w:b/>
-          <w:sz w:val="28"/>
-          <w:szCs w:val="28"/>
-          <w:u w:val="single"/>
-        </w:rPr>
-      </w:pPr>
-    </w:p>
-    <w:p>
-      <w:pPr>
-        <w:pStyle w:val="KeinLeerraum"/>
         <w:rPr>
           <w:b/>
           <w:bCs/>
+          <w:lang w:val="en-US"/>
         </w:rPr>
       </w:pPr>
     </w:p>
@@ -1320,16 +1860,16 @@
         <mc:AlternateContent>
           <mc:Choice Requires="wps">
             <w:drawing>
-              <wp:anchor distT="0" distB="0" distL="114300" distR="114300" simplePos="0" relativeHeight="251661312" behindDoc="0" locked="0" layoutInCell="1" allowOverlap="1" wp14:anchorId="102AA3C8" wp14:editId="5AD2BF1A">
+              <wp:anchor distT="0" distB="0" distL="114300" distR="114300" simplePos="0" relativeHeight="251661312" behindDoc="0" locked="0" layoutInCell="1" allowOverlap="1" wp14:anchorId="102AA3C8" wp14:editId="5C01CDCB">
                 <wp:simplePos x="0" y="0"/>
                 <wp:positionH relativeFrom="column">
-                  <wp:posOffset>130810</wp:posOffset>
+                  <wp:posOffset>227214</wp:posOffset>
                 </wp:positionH>
                 <wp:positionV relativeFrom="paragraph">
-                  <wp:posOffset>2240915</wp:posOffset>
+                  <wp:posOffset>4164965</wp:posOffset>
                 </wp:positionV>
-                <wp:extent cx="3282950" cy="1854200"/>
-                <wp:effectExtent l="19050" t="19050" r="12700" b="12700"/>
+                <wp:extent cx="4843895" cy="1854200"/>
+                <wp:effectExtent l="19050" t="19050" r="13970" b="12700"/>
                 <wp:wrapNone/>
                 <wp:docPr id="1521954222" name="Rechteck 5"/>
                 <wp:cNvGraphicFramePr/>
@@ -1340,7 +1880,7 @@
                       <wps:spPr>
                         <a:xfrm>
                           <a:off x="0" y="0"/>
-                          <a:ext cx="3282950" cy="1854200"/>
+                          <a:ext cx="4843895" cy="1854200"/>
                         </a:xfrm>
                         <a:prstGeom prst="rect">
                           <a:avLst/>
@@ -1387,7 +1927,7 @@
           </mc:Choice>
           <mc:Fallback>
             <w:pict>
-              <v:rect w14:anchorId="34821034" id="Rechteck 5" o:spid="_x0000_s1026" style="position:absolute;margin-left:10.3pt;margin-top:176.45pt;width:258.5pt;height:146pt;z-index:251661312;visibility:visible;mso-wrap-style:square;mso-width-percent:0;mso-wrap-distance-left:9pt;mso-wrap-distance-top:0;mso-wrap-distance-right:9pt;mso-wrap-distance-bottom:0;mso-position-horizontal:absolute;mso-position-horizontal-relative:text;mso-position-vertical:absolute;mso-position-vertical-relative:text;mso-width-percent:0;mso-width-relative:margin;v-text-anchor:middle" o:gfxdata="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" filled="f" strokecolor="#e00" strokeweight="3pt">
+              <v:rect w14:anchorId="72E1BA83" id="Rechteck 5" o:spid="_x0000_s1026" style="position:absolute;margin-left:17.9pt;margin-top:327.95pt;width:381.4pt;height:146pt;z-index:251661312;visibility:visible;mso-wrap-style:square;mso-width-percent:0;mso-wrap-distance-left:9pt;mso-wrap-distance-top:0;mso-wrap-distance-right:9pt;mso-wrap-distance-bottom:0;mso-position-horizontal:absolute;mso-position-horizontal-relative:text;mso-position-vertical:absolute;mso-position-vertical-relative:text;mso-width-percent:0;mso-width-relative:margin;v-text-anchor:middle" o:gfxdata="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" filled="f" strokecolor="#e00" strokeweight="3pt">
                 <v:stroke joinstyle="round"/>
               </v:rect>
             </w:pict>
@@ -1399,9 +1939,9 @@
           <w:noProof/>
         </w:rPr>
         <w:drawing>
-          <wp:inline distT="0" distB="0" distL="0" distR="0" wp14:anchorId="02C0DAC6" wp14:editId="6DF85BD7">
-            <wp:extent cx="3471333" cy="5495568"/>
-            <wp:effectExtent l="0" t="0" r="0" b="0"/>
+          <wp:inline distT="0" distB="0" distL="0" distR="0" wp14:anchorId="02C0DAC6" wp14:editId="0E037E00">
+            <wp:extent cx="5181600" cy="8203139"/>
+            <wp:effectExtent l="0" t="0" r="0" b="7620"/>
             <wp:docPr id="938288719" name="Grafik 3"/>
             <wp:cNvGraphicFramePr>
               <a:graphicFrameLocks xmlns:a="http://schemas.openxmlformats.org/drawingml/2006/main" noChangeAspect="1"/>
@@ -1416,7 +1956,7 @@
                     </pic:cNvPicPr>
                   </pic:nvPicPr>
                   <pic:blipFill rotWithShape="1">
-                    <a:blip r:embed="rId13" cstate="print">
+                    <a:blip r:embed="rId14" cstate="print">
                       <a:extLst>
                         <a:ext uri="{28A0092B-C50C-407E-A947-70E740481C1C}">
                           <a14:useLocalDpi xmlns:a14="http://schemas.microsoft.com/office/drawing/2010/main" val="0"/>
@@ -1431,7 +1971,7 @@
                   <pic:spPr bwMode="auto">
                     <a:xfrm>
                       <a:off x="0" y="0"/>
-                      <a:ext cx="3475708" cy="5502493"/>
+                      <a:ext cx="5181600" cy="8203139"/>
                     </a:xfrm>
                     <a:prstGeom prst="rect">
                       <a:avLst/>
@@ -1456,6 +1996,7 @@
     <w:p>
       <w:pPr>
         <w:pStyle w:val="KeinLeerraum"/>
+        <w:jc w:val="both"/>
         <w:rPr>
           <w:b/>
           <w:bCs/>
@@ -1465,141 +2006,6 @@
     <w:p>
       <w:pPr>
         <w:pStyle w:val="KeinLeerraum"/>
-        <w:rPr>
-          <w:b/>
-          <w:bCs/>
-        </w:rPr>
-      </w:pPr>
-    </w:p>
-    <w:p>
-      <w:pPr>
-        <w:pStyle w:val="KeinLeerraum"/>
-        <w:rPr>
-          <w:b/>
-          <w:bCs/>
-        </w:rPr>
-      </w:pPr>
-    </w:p>
-    <w:p>
-      <w:pPr>
-        <w:pStyle w:val="KeinLeerraum"/>
-        <w:rPr>
-          <w:b/>
-          <w:bCs/>
-        </w:rPr>
-      </w:pPr>
-    </w:p>
-    <w:p>
-      <w:pPr>
-        <w:pStyle w:val="KeinLeerraum"/>
-        <w:rPr>
-          <w:b/>
-          <w:bCs/>
-        </w:rPr>
-      </w:pPr>
-    </w:p>
-    <w:p>
-      <w:pPr>
-        <w:pStyle w:val="KeinLeerraum"/>
-        <w:rPr>
-          <w:b/>
-          <w:bCs/>
-        </w:rPr>
-      </w:pPr>
-    </w:p>
-    <w:p>
-      <w:pPr>
-        <w:pStyle w:val="KeinLeerraum"/>
-        <w:rPr>
-          <w:b/>
-          <w:bCs/>
-        </w:rPr>
-      </w:pPr>
-    </w:p>
-    <w:p>
-      <w:pPr>
-        <w:pStyle w:val="KeinLeerraum"/>
-        <w:rPr>
-          <w:b/>
-          <w:bCs/>
-        </w:rPr>
-      </w:pPr>
-    </w:p>
-    <w:p>
-      <w:pPr>
-        <w:pStyle w:val="KeinLeerraum"/>
-        <w:rPr>
-          <w:b/>
-          <w:bCs/>
-        </w:rPr>
-      </w:pPr>
-    </w:p>
-    <w:p>
-      <w:pPr>
-        <w:pStyle w:val="KeinLeerraum"/>
-        <w:rPr>
-          <w:b/>
-          <w:bCs/>
-        </w:rPr>
-      </w:pPr>
-    </w:p>
-    <w:p>
-      <w:pPr>
-        <w:pStyle w:val="KeinLeerraum"/>
-        <w:rPr>
-          <w:b/>
-          <w:bCs/>
-        </w:rPr>
-      </w:pPr>
-    </w:p>
-    <w:p>
-      <w:pPr>
-        <w:pStyle w:val="KeinLeerraum"/>
-        <w:rPr>
-          <w:b/>
-          <w:bCs/>
-        </w:rPr>
-      </w:pPr>
-    </w:p>
-    <w:p>
-      <w:pPr>
-        <w:pStyle w:val="KeinLeerraum"/>
-        <w:rPr>
-          <w:b/>
-          <w:bCs/>
-        </w:rPr>
-      </w:pPr>
-    </w:p>
-    <w:p>
-      <w:pPr>
-        <w:pStyle w:val="KeinLeerraum"/>
-        <w:rPr>
-          <w:b/>
-          <w:bCs/>
-        </w:rPr>
-      </w:pPr>
-    </w:p>
-    <w:p>
-      <w:pPr>
-        <w:pStyle w:val="KeinLeerraum"/>
-        <w:rPr>
-          <w:b/>
-          <w:bCs/>
-        </w:rPr>
-      </w:pPr>
-    </w:p>
-    <w:p>
-      <w:pPr>
-        <w:pStyle w:val="KeinLeerraum"/>
-        <w:rPr>
-          <w:b/>
-          <w:bCs/>
-        </w:rPr>
-      </w:pPr>
-    </w:p>
-    <w:p>
-      <w:pPr>
-        <w:pStyle w:val="KeinLeerraum"/>
         <w:jc w:val="both"/>
         <w:rPr>
           <w:b/>
@@ -1609,7 +2015,11 @@
           <w:lang w:val="en-GB"/>
         </w:rPr>
       </w:pPr>
-      <w:r>
+    </w:p>
+    <w:p>
+      <w:pPr>
+        <w:pStyle w:val="KeinLeerraum"/>
+        <w:jc w:val="both"/>
         <w:rPr>
           <w:b/>
           <w:sz w:val="28"/>
@@ -1617,10 +2027,12 @@
           <w:u w:val="single"/>
           <w:lang w:val="en-GB"/>
         </w:rPr>
-        <w:lastRenderedPageBreak/>
-        <w:t>Wireframe 3.</w:t>
-      </w:r>
-      <w:r>
+      </w:pPr>
+    </w:p>
+    <w:p>
+      <w:pPr>
+        <w:pStyle w:val="KeinLeerraum"/>
+        <w:jc w:val="both"/>
         <w:rPr>
           <w:b/>
           <w:sz w:val="28"/>
@@ -1628,9 +2040,12 @@
           <w:u w:val="single"/>
           <w:lang w:val="en-GB"/>
         </w:rPr>
-        <w:t>2</w:t>
-      </w:r>
-      <w:r>
+      </w:pPr>
+    </w:p>
+    <w:p>
+      <w:pPr>
+        <w:pStyle w:val="KeinLeerraum"/>
+        <w:jc w:val="both"/>
         <w:rPr>
           <w:b/>
           <w:sz w:val="28"/>
@@ -1638,8 +2053,7 @@
           <w:u w:val="single"/>
           <w:lang w:val="en-GB"/>
         </w:rPr>
-        <w:t xml:space="preserve">: </w:t>
-      </w:r>
+      </w:pPr>
       <w:r>
         <w:rPr>
           <w:b/>
@@ -1648,7 +2062,7 @@
           <w:u w:val="single"/>
           <w:lang w:val="en-GB"/>
         </w:rPr>
-        <w:t>Bottom</w:t>
+        <w:t xml:space="preserve">Wireframe </w:t>
       </w:r>
       <w:r>
         <w:rPr>
@@ -1658,7 +2072,17 @@
           <w:u w:val="single"/>
           <w:lang w:val="en-GB"/>
         </w:rPr>
-        <w:t>-Landingpage</w:t>
+        <w:t>4</w:t>
+      </w:r>
+      <w:r>
+        <w:rPr>
+          <w:b/>
+          <w:sz w:val="28"/>
+          <w:szCs w:val="28"/>
+          <w:u w:val="single"/>
+          <w:lang w:val="en-GB"/>
+        </w:rPr>
+        <w:t>.2: Bottom-Landingpage</w:t>
       </w:r>
     </w:p>
     <w:p>
@@ -1670,24 +2094,14 @@
           <w:lang w:val="en-GB"/>
         </w:rPr>
       </w:pPr>
-    </w:p>
-    <w:p>
-      <w:pPr>
-        <w:pStyle w:val="KeinLeerraum"/>
-        <w:rPr>
-          <w:b/>
-          <w:bCs/>
-          <w:lang w:val="en-GB"/>
-        </w:rPr>
-      </w:pPr>
       <w:r>
         <w:rPr>
           <w:noProof/>
         </w:rPr>
         <w:drawing>
-          <wp:inline distT="0" distB="0" distL="0" distR="0" wp14:anchorId="5ED2DC48" wp14:editId="10C4EE58">
-            <wp:extent cx="3158066" cy="6032696"/>
-            <wp:effectExtent l="0" t="0" r="4445" b="6350"/>
+          <wp:inline distT="0" distB="0" distL="0" distR="0" wp14:anchorId="5ED2DC48" wp14:editId="2B0F1400">
+            <wp:extent cx="4391891" cy="8389610"/>
+            <wp:effectExtent l="0" t="0" r="8890" b="0"/>
             <wp:docPr id="1640462913" name="Grafik 4"/>
             <wp:cNvGraphicFramePr>
               <a:graphicFrameLocks xmlns:a="http://schemas.openxmlformats.org/drawingml/2006/main" noChangeAspect="1"/>
@@ -1702,7 +2116,7 @@
                     </pic:cNvPicPr>
                   </pic:nvPicPr>
                   <pic:blipFill rotWithShape="1">
-                    <a:blip r:embed="rId14" cstate="print">
+                    <a:blip r:embed="rId15" cstate="print">
                       <a:extLst>
                         <a:ext uri="{28A0092B-C50C-407E-A947-70E740481C1C}">
                           <a14:useLocalDpi xmlns:a14="http://schemas.microsoft.com/office/drawing/2010/main" val="0"/>
@@ -1717,7 +2131,7 @@
                   <pic:spPr bwMode="auto">
                     <a:xfrm>
                       <a:off x="0" y="0"/>
-                      <a:ext cx="3160339" cy="6037038"/>
+                      <a:ext cx="4391891" cy="8389610"/>
                     </a:xfrm>
                     <a:prstGeom prst="rect">
                       <a:avLst/>
@@ -1758,117 +2172,14 @@
           <w:szCs w:val="32"/>
         </w:rPr>
       </w:pPr>
-    </w:p>
-    <w:p>
-      <w:pPr>
-        <w:pStyle w:val="KeinLeerraum"/>
+      <w:r>
         <w:rPr>
           <w:b/>
           <w:sz w:val="32"/>
           <w:szCs w:val="32"/>
         </w:rPr>
-      </w:pPr>
-    </w:p>
-    <w:p>
-      <w:pPr>
-        <w:pStyle w:val="KeinLeerraum"/>
-        <w:rPr>
-          <w:b/>
-          <w:sz w:val="32"/>
-          <w:szCs w:val="32"/>
-        </w:rPr>
-      </w:pPr>
-    </w:p>
-    <w:p>
-      <w:pPr>
-        <w:pStyle w:val="KeinLeerraum"/>
-        <w:rPr>
-          <w:b/>
-          <w:sz w:val="32"/>
-          <w:szCs w:val="32"/>
-        </w:rPr>
-      </w:pPr>
-    </w:p>
-    <w:p>
-      <w:pPr>
-        <w:pStyle w:val="KeinLeerraum"/>
-        <w:rPr>
-          <w:b/>
-          <w:sz w:val="32"/>
-          <w:szCs w:val="32"/>
-        </w:rPr>
-      </w:pPr>
-    </w:p>
-    <w:p>
-      <w:pPr>
-        <w:pStyle w:val="KeinLeerraum"/>
-        <w:rPr>
-          <w:b/>
-          <w:sz w:val="32"/>
-          <w:szCs w:val="32"/>
-        </w:rPr>
-      </w:pPr>
-    </w:p>
-    <w:p>
-      <w:pPr>
-        <w:pStyle w:val="KeinLeerraum"/>
-        <w:rPr>
-          <w:b/>
-          <w:sz w:val="32"/>
-          <w:szCs w:val="32"/>
-        </w:rPr>
-      </w:pPr>
-    </w:p>
-    <w:p>
-      <w:pPr>
-        <w:pStyle w:val="KeinLeerraum"/>
-        <w:rPr>
-          <w:b/>
-          <w:sz w:val="32"/>
-          <w:szCs w:val="32"/>
-        </w:rPr>
-      </w:pPr>
-    </w:p>
-    <w:p>
-      <w:pPr>
-        <w:pStyle w:val="KeinLeerraum"/>
-        <w:rPr>
-          <w:b/>
-          <w:sz w:val="32"/>
-          <w:szCs w:val="32"/>
-        </w:rPr>
-      </w:pPr>
-    </w:p>
-    <w:p>
-      <w:pPr>
-        <w:pStyle w:val="KeinLeerraum"/>
-        <w:rPr>
-          <w:b/>
-          <w:sz w:val="32"/>
-          <w:szCs w:val="32"/>
-        </w:rPr>
-      </w:pPr>
-    </w:p>
-    <w:p>
-      <w:pPr>
-        <w:pStyle w:val="KeinLeerraum"/>
-        <w:rPr>
-          <w:b/>
-          <w:sz w:val="32"/>
-          <w:szCs w:val="32"/>
-        </w:rPr>
-      </w:pPr>
-      <w:proofErr w:type="spellStart"/>
-      <w:r>
-        <w:rPr>
-          <w:b/>
-          <w:sz w:val="32"/>
-          <w:szCs w:val="32"/>
-        </w:rPr>
-        <w:lastRenderedPageBreak/>
         <w:t>ParkShare</w:t>
       </w:r>
-      <w:proofErr w:type="spellEnd"/>
     </w:p>
     <w:p>
       <w:pPr>
@@ -1936,9 +2247,22 @@
         <w:pStyle w:val="KeinLeerraum"/>
         <w:rPr>
           <w:b/>
-          <w:bCs/>
-        </w:rPr>
-      </w:pPr>
+        </w:rPr>
+      </w:pPr>
+    </w:p>
+    <w:p>
+      <w:pPr>
+        <w:pStyle w:val="KeinLeerraum"/>
+        <w:rPr>
+          <w:b/>
+        </w:rPr>
+      </w:pPr>
+      <w:r>
+        <w:rPr>
+          <w:b/>
+        </w:rPr>
+        <w:t>User Flow:</w:t>
+      </w:r>
     </w:p>
     <w:p>
       <w:pPr>
@@ -1960,13 +2284,8 @@
           <w:numId w:val="3"/>
         </w:numPr>
       </w:pPr>
-      <w:proofErr w:type="spellStart"/>
-      <w:r>
-        <w:t>ParkShare</w:t>
-      </w:r>
-      <w:proofErr w:type="spellEnd"/>
-      <w:r>
-        <w:t xml:space="preserve"> zeigt die verfügbaren privaten Parkplätze an.</w:t>
+      <w:r>
+        <w:t>ParkShare zeigt die verfügbaren privaten Parkplätze an.</w:t>
       </w:r>
     </w:p>
     <w:p>
@@ -2118,21 +2437,7 @@
         <w:rPr>
           <w:bCs/>
         </w:rPr>
-        <w:t xml:space="preserve"> und bereit ist, einen verfügbaren Parkplatz über </w:t>
-      </w:r>
-      <w:proofErr w:type="spellStart"/>
-      <w:r>
-        <w:rPr>
-          <w:bCs/>
-        </w:rPr>
-        <w:t>ParkShare</w:t>
-      </w:r>
-      <w:proofErr w:type="spellEnd"/>
-      <w:r>
-        <w:rPr>
-          <w:bCs/>
-        </w:rPr>
-        <w:t xml:space="preserve"> zu reservieren.</w:t>
+        <w:t xml:space="preserve"> und bereit ist, einen verfügbaren Parkplatz über ParkShare zu reservieren.</w:t>
       </w:r>
     </w:p>
     <w:p>
@@ -2166,21 +2471,7 @@
         <w:rPr>
           <w:b/>
         </w:rPr>
-        <w:t xml:space="preserve">dass die in </w:t>
-      </w:r>
-      <w:proofErr w:type="spellStart"/>
-      <w:r>
-        <w:rPr>
-          <w:b/>
-        </w:rPr>
-        <w:t>ParkShare</w:t>
-      </w:r>
-      <w:proofErr w:type="spellEnd"/>
-      <w:r>
-        <w:rPr>
-          <w:b/>
-        </w:rPr>
-        <w:t xml:space="preserve"> angezeigten Parkplätze tatsächlich verfügbar und zuverlässig reservierbar sind, sodass die Person nach der Reservation sicher einen Parkplatz vorfindet.</w:t>
+        <w:t>dass die in ParkShare angezeigten Parkplätze tatsächlich verfügbar und zuverlässig reservierbar sind, sodass die Person nach der Reservation sicher einen Parkplatz vorfindet.</w:t>
       </w:r>
     </w:p>
     <w:p>
@@ -2384,7 +2675,7 @@
                     </pic:cNvPicPr>
                   </pic:nvPicPr>
                   <pic:blipFill>
-                    <a:blip r:embed="rId15" cstate="print">
+                    <a:blip r:embed="rId16" cstate="print">
                       <a:extLst>
                         <a:ext uri="{28A0092B-C50C-407E-A947-70E740481C1C}">
                           <a14:useLocalDpi xmlns:a14="http://schemas.microsoft.com/office/drawing/2010/main" val="0"/>
@@ -2481,7 +2772,6 @@
           <w:u w:val="single"/>
           <w:lang w:val="en-GB"/>
         </w:rPr>
-        <w:lastRenderedPageBreak/>
         <w:t xml:space="preserve">Wireframe </w:t>
       </w:r>
       <w:r>
@@ -2551,7 +2841,7 @@
                     </pic:cNvPicPr>
                   </pic:nvPicPr>
                   <pic:blipFill>
-                    <a:blip r:embed="rId16" cstate="print">
+                    <a:blip r:embed="rId17" cstate="print">
                       <a:extLst>
                         <a:ext uri="{28A0092B-C50C-407E-A947-70E740481C1C}">
                           <a14:useLocalDpi xmlns:a14="http://schemas.microsoft.com/office/drawing/2010/main" val="0"/>
@@ -2703,7 +2993,6 @@
           <w:u w:val="single"/>
           <w:lang w:val="en-GB"/>
         </w:rPr>
-        <w:lastRenderedPageBreak/>
         <w:t xml:space="preserve">Wireframe </w:t>
       </w:r>
       <w:r>
@@ -2768,7 +3057,7 @@
                     </pic:cNvPicPr>
                   </pic:nvPicPr>
                   <pic:blipFill>
-                    <a:blip r:embed="rId17" cstate="print">
+                    <a:blip r:embed="rId18" cstate="print">
                       <a:extLst>
                         <a:ext uri="{28A0092B-C50C-407E-A947-70E740481C1C}">
                           <a14:useLocalDpi xmlns:a14="http://schemas.microsoft.com/office/drawing/2010/main" val="0"/>
@@ -2801,7 +3090,7 @@
       </w:r>
     </w:p>
     <w:sectPr>
-      <w:footerReference w:type="default" r:id="rId18"/>
+      <w:footerReference w:type="default" r:id="rId19"/>
       <w:pgSz w:w="11906" w:h="16838"/>
       <w:pgMar w:top="1134" w:right="1134" w:bottom="1134" w:left="1134" w:header="708" w:footer="708" w:gutter="0"/>
       <w:cols w:space="708"/>
@@ -4069,6 +4358,7 @@
   <w:style w:type="character" w:default="1" w:styleId="Absatz-Standardschriftart">
     <w:name w:val="Default Paragraph Font"/>
     <w:uiPriority w:val="1"/>
+    <w:semiHidden/>
     <w:unhideWhenUsed/>
   </w:style>
   <w:style w:type="table" w:default="1" w:styleId="NormaleTabelle">

</xml_diff>